<commit_message>
Refresh generated DOCX artifacts
</commit_message>
<xml_diff>
--- a/odigoi/01_lab1-docker.docx
+++ b/odigoi/01_lab1-docker.docx
@@ -20,7 +20,7 @@
           <w:sz w:val="22"/>
           <w:szCs w:val="22"/>
         </w:rPr>
-        <w:id w:val="1210843921"/>
+        <w:id w:val="-935753619"/>
         <w:docPartObj>
           <w:docPartGallery w:val="Table of Contents"/>
           <w:docPartUnique/>
@@ -48,7 +48,7 @@
               <w:kern w:val="2"/>
               <w:sz w:val="24"/>
               <w:szCs w:val="24"/>
-              <w:lang w:val="el-GR" w:eastAsia="el-GR" w:bidi="he-IL"/>
+              <w:lang w:val="el-GR" w:eastAsia="el-GR"/>
               <w14:ligatures w14:val="standardContextual"/>
             </w:rPr>
           </w:pPr>
@@ -61,7 +61,7 @@
           <w:r>
             <w:fldChar w:fldCharType="separate"/>
           </w:r>
-          <w:hyperlink w:anchor="_Toc224590056" w:history="1">
+          <w:hyperlink w:anchor="_Toc224640996" w:history="1">
             <w:r>
               <w:rPr>
                 <w:rStyle w:val="Hyperlink"/>
@@ -88,7 +88,7 @@
                 <w:noProof/>
                 <w:webHidden/>
               </w:rPr>
-              <w:instrText xml:space="preserve"> PAGEREF _Toc224590056 \h </w:instrText>
+              <w:instrText xml:space="preserve"> PAGEREF _Toc224640996 \h </w:instrText>
             </w:r>
             <w:r>
               <w:rPr>
@@ -131,11 +131,11 @@
               <w:kern w:val="2"/>
               <w:sz w:val="24"/>
               <w:szCs w:val="24"/>
-              <w:lang w:val="el-GR" w:eastAsia="el-GR" w:bidi="he-IL"/>
+              <w:lang w:val="el-GR" w:eastAsia="el-GR"/>
               <w14:ligatures w14:val="standardContextual"/>
             </w:rPr>
           </w:pPr>
-          <w:hyperlink w:anchor="_Toc224590057" w:history="1">
+          <w:hyperlink w:anchor="_Toc224640997" w:history="1">
             <w:r>
               <w:rPr>
                 <w:rStyle w:val="Hyperlink"/>
@@ -162,7 +162,7 @@
                 <w:noProof/>
                 <w:webHidden/>
               </w:rPr>
-              <w:instrText xml:space="preserve"> PAGEREF _Toc224590057 \h </w:instrText>
+              <w:instrText xml:space="preserve"> PAGEREF _Toc224640997 \h </w:instrText>
             </w:r>
             <w:r>
               <w:rPr>
@@ -205,11 +205,11 @@
               <w:kern w:val="2"/>
               <w:sz w:val="24"/>
               <w:szCs w:val="24"/>
-              <w:lang w:val="el-GR" w:eastAsia="el-GR" w:bidi="he-IL"/>
+              <w:lang w:val="el-GR" w:eastAsia="el-GR"/>
               <w14:ligatures w14:val="standardContextual"/>
             </w:rPr>
           </w:pPr>
-          <w:hyperlink w:anchor="_Toc224590058" w:history="1">
+          <w:hyperlink w:anchor="_Toc224640998" w:history="1">
             <w:r>
               <w:rPr>
                 <w:rStyle w:val="Hyperlink"/>
@@ -236,7 +236,7 @@
                 <w:noProof/>
                 <w:webHidden/>
               </w:rPr>
-              <w:instrText xml:space="preserve"> PAGEREF _Toc224590058 \h </w:instrText>
+              <w:instrText xml:space="preserve"> PAGEREF _Toc224640998 \h </w:instrText>
             </w:r>
             <w:r>
               <w:rPr>
@@ -279,11 +279,11 @@
               <w:kern w:val="2"/>
               <w:sz w:val="24"/>
               <w:szCs w:val="24"/>
-              <w:lang w:val="el-GR" w:eastAsia="el-GR" w:bidi="he-IL"/>
+              <w:lang w:val="el-GR" w:eastAsia="el-GR"/>
               <w14:ligatures w14:val="standardContextual"/>
             </w:rPr>
           </w:pPr>
-          <w:hyperlink w:anchor="_Toc224590059" w:history="1">
+          <w:hyperlink w:anchor="_Toc224640999" w:history="1">
             <w:r>
               <w:rPr>
                 <w:rStyle w:val="Hyperlink"/>
@@ -310,7 +310,7 @@
                 <w:noProof/>
                 <w:webHidden/>
               </w:rPr>
-              <w:instrText xml:space="preserve"> PAGEREF _Toc224590059 \h </w:instrText>
+              <w:instrText xml:space="preserve"> PAGEREF _Toc224640999 \h </w:instrText>
             </w:r>
             <w:r>
               <w:rPr>
@@ -353,11 +353,11 @@
               <w:kern w:val="2"/>
               <w:sz w:val="24"/>
               <w:szCs w:val="24"/>
-              <w:lang w:val="el-GR" w:eastAsia="el-GR" w:bidi="he-IL"/>
+              <w:lang w:val="el-GR" w:eastAsia="el-GR"/>
               <w14:ligatures w14:val="standardContextual"/>
             </w:rPr>
           </w:pPr>
-          <w:hyperlink w:anchor="_Toc224590060" w:history="1">
+          <w:hyperlink w:anchor="_Toc224641000" w:history="1">
             <w:r>
               <w:rPr>
                 <w:rStyle w:val="Hyperlink"/>
@@ -384,7 +384,7 @@
                 <w:noProof/>
                 <w:webHidden/>
               </w:rPr>
-              <w:instrText xml:space="preserve"> PAGEREF _Toc224590060 \h </w:instrText>
+              <w:instrText xml:space="preserve"> PAGEREF _Toc224641000 \h </w:instrText>
             </w:r>
             <w:r>
               <w:rPr>
@@ -427,11 +427,11 @@
               <w:kern w:val="2"/>
               <w:sz w:val="24"/>
               <w:szCs w:val="24"/>
-              <w:lang w:val="el-GR" w:eastAsia="el-GR" w:bidi="he-IL"/>
+              <w:lang w:val="el-GR" w:eastAsia="el-GR"/>
               <w14:ligatures w14:val="standardContextual"/>
             </w:rPr>
           </w:pPr>
-          <w:hyperlink w:anchor="_Toc224590061" w:history="1">
+          <w:hyperlink w:anchor="_Toc224641001" w:history="1">
             <w:r>
               <w:rPr>
                 <w:rStyle w:val="Hyperlink"/>
@@ -467,7 +467,7 @@
                 <w:noProof/>
                 <w:webHidden/>
               </w:rPr>
-              <w:instrText xml:space="preserve"> PAGEREF _Toc224590061 \h </w:instrText>
+              <w:instrText xml:space="preserve"> PAGEREF _Toc224641001 \h </w:instrText>
             </w:r>
             <w:r>
               <w:rPr>
@@ -510,11 +510,11 @@
               <w:kern w:val="2"/>
               <w:sz w:val="24"/>
               <w:szCs w:val="24"/>
-              <w:lang w:val="el-GR" w:eastAsia="el-GR" w:bidi="he-IL"/>
+              <w:lang w:val="el-GR" w:eastAsia="el-GR"/>
               <w14:ligatures w14:val="standardContextual"/>
             </w:rPr>
           </w:pPr>
-          <w:hyperlink w:anchor="_Toc224590062" w:history="1">
+          <w:hyperlink w:anchor="_Toc224641002" w:history="1">
             <w:r>
               <w:rPr>
                 <w:rStyle w:val="Hyperlink"/>
@@ -550,7 +550,7 @@
                 <w:noProof/>
                 <w:webHidden/>
               </w:rPr>
-              <w:instrText xml:space="preserve"> PAGEREF _Toc224590062 \h </w:instrText>
+              <w:instrText xml:space="preserve"> PAGEREF _Toc224641002 \h </w:instrText>
             </w:r>
             <w:r>
               <w:rPr>
@@ -593,11 +593,11 @@
               <w:kern w:val="2"/>
               <w:sz w:val="24"/>
               <w:szCs w:val="24"/>
-              <w:lang w:val="el-GR" w:eastAsia="el-GR" w:bidi="he-IL"/>
+              <w:lang w:val="el-GR" w:eastAsia="el-GR"/>
               <w14:ligatures w14:val="standardContextual"/>
             </w:rPr>
           </w:pPr>
-          <w:hyperlink w:anchor="_Toc224590063" w:history="1">
+          <w:hyperlink w:anchor="_Toc224641003" w:history="1">
             <w:r>
               <w:rPr>
                 <w:rStyle w:val="Hyperlink"/>
@@ -624,7 +624,7 @@
                 <w:noProof/>
                 <w:webHidden/>
               </w:rPr>
-              <w:instrText xml:space="preserve"> PAGEREF _Toc224590063 \h </w:instrText>
+              <w:instrText xml:space="preserve"> PAGEREF _Toc224641003 \h </w:instrText>
             </w:r>
             <w:r>
               <w:rPr>
@@ -667,11 +667,11 @@
               <w:kern w:val="2"/>
               <w:sz w:val="24"/>
               <w:szCs w:val="24"/>
-              <w:lang w:val="el-GR" w:eastAsia="el-GR" w:bidi="he-IL"/>
+              <w:lang w:val="el-GR" w:eastAsia="el-GR"/>
               <w14:ligatures w14:val="standardContextual"/>
             </w:rPr>
           </w:pPr>
-          <w:hyperlink w:anchor="_Toc224590064" w:history="1">
+          <w:hyperlink w:anchor="_Toc224641004" w:history="1">
             <w:r>
               <w:rPr>
                 <w:rStyle w:val="Hyperlink"/>
@@ -698,7 +698,7 @@
                 <w:noProof/>
                 <w:webHidden/>
               </w:rPr>
-              <w:instrText xml:space="preserve"> PAGEREF _Toc224590064 \h </w:instrText>
+              <w:instrText xml:space="preserve"> PAGEREF _Toc224641004 \h </w:instrText>
             </w:r>
             <w:r>
               <w:rPr>
@@ -741,11 +741,11 @@
               <w:kern w:val="2"/>
               <w:sz w:val="24"/>
               <w:szCs w:val="24"/>
-              <w:lang w:val="el-GR" w:eastAsia="el-GR" w:bidi="he-IL"/>
+              <w:lang w:val="el-GR" w:eastAsia="el-GR"/>
               <w14:ligatures w14:val="standardContextual"/>
             </w:rPr>
           </w:pPr>
-          <w:hyperlink w:anchor="_Toc224590065" w:history="1">
+          <w:hyperlink w:anchor="_Toc224641005" w:history="1">
             <w:r>
               <w:rPr>
                 <w:rStyle w:val="Hyperlink"/>
@@ -772,7 +772,7 @@
                 <w:noProof/>
                 <w:webHidden/>
               </w:rPr>
-              <w:instrText xml:space="preserve"> PAGEREF _Toc224590065 \h </w:instrText>
+              <w:instrText xml:space="preserve"> PAGEREF _Toc224641005 \h </w:instrText>
             </w:r>
             <w:r>
               <w:rPr>
@@ -815,11 +815,11 @@
               <w:kern w:val="2"/>
               <w:sz w:val="24"/>
               <w:szCs w:val="24"/>
-              <w:lang w:val="el-GR" w:eastAsia="el-GR" w:bidi="he-IL"/>
+              <w:lang w:val="el-GR" w:eastAsia="el-GR"/>
               <w14:ligatures w14:val="standardContextual"/>
             </w:rPr>
           </w:pPr>
-          <w:hyperlink w:anchor="_Toc224590066" w:history="1">
+          <w:hyperlink w:anchor="_Toc224641006" w:history="1">
             <w:r>
               <w:rPr>
                 <w:rStyle w:val="Hyperlink"/>
@@ -846,7 +846,7 @@
                 <w:noProof/>
                 <w:webHidden/>
               </w:rPr>
-              <w:instrText xml:space="preserve"> PAGEREF _Toc224590066 \h </w:instrText>
+              <w:instrText xml:space="preserve"> PAGEREF _Toc224641006 \h </w:instrText>
             </w:r>
             <w:r>
               <w:rPr>
@@ -889,11 +889,11 @@
               <w:kern w:val="2"/>
               <w:sz w:val="24"/>
               <w:szCs w:val="24"/>
-              <w:lang w:val="el-GR" w:eastAsia="el-GR" w:bidi="he-IL"/>
+              <w:lang w:val="el-GR" w:eastAsia="el-GR"/>
               <w14:ligatures w14:val="standardContextual"/>
             </w:rPr>
           </w:pPr>
-          <w:hyperlink w:anchor="_Toc224590067" w:history="1">
+          <w:hyperlink w:anchor="_Toc224641007" w:history="1">
             <w:r>
               <w:rPr>
                 <w:rStyle w:val="Hyperlink"/>
@@ -920,7 +920,7 @@
                 <w:noProof/>
                 <w:webHidden/>
               </w:rPr>
-              <w:instrText xml:space="preserve"> PAGEREF _Toc224590067 \h </w:instrText>
+              <w:instrText xml:space="preserve"> PAGEREF _Toc224641007 \h </w:instrText>
             </w:r>
             <w:r>
               <w:rPr>
@@ -963,11 +963,11 @@
               <w:kern w:val="2"/>
               <w:sz w:val="24"/>
               <w:szCs w:val="24"/>
-              <w:lang w:val="el-GR" w:eastAsia="el-GR" w:bidi="he-IL"/>
+              <w:lang w:val="el-GR" w:eastAsia="el-GR"/>
               <w14:ligatures w14:val="standardContextual"/>
             </w:rPr>
           </w:pPr>
-          <w:hyperlink w:anchor="_Toc224590068" w:history="1">
+          <w:hyperlink w:anchor="_Toc224641008" w:history="1">
             <w:r>
               <w:rPr>
                 <w:rStyle w:val="Hyperlink"/>
@@ -1003,7 +1003,7 @@
                 <w:noProof/>
                 <w:webHidden/>
               </w:rPr>
-              <w:instrText xml:space="preserve"> PAGEREF _Toc224590068 \h </w:instrText>
+              <w:instrText xml:space="preserve"> PAGEREF _Toc224641008 \h </w:instrText>
             </w:r>
             <w:r>
               <w:rPr>
@@ -1046,11 +1046,11 @@
               <w:kern w:val="2"/>
               <w:sz w:val="24"/>
               <w:szCs w:val="24"/>
-              <w:lang w:val="el-GR" w:eastAsia="el-GR" w:bidi="he-IL"/>
+              <w:lang w:val="el-GR" w:eastAsia="el-GR"/>
               <w14:ligatures w14:val="standardContextual"/>
             </w:rPr>
           </w:pPr>
-          <w:hyperlink w:anchor="_Toc224590069" w:history="1">
+          <w:hyperlink w:anchor="_Toc224641009" w:history="1">
             <w:r>
               <w:rPr>
                 <w:rStyle w:val="Hyperlink"/>
@@ -1077,7 +1077,7 @@
                 <w:noProof/>
                 <w:webHidden/>
               </w:rPr>
-              <w:instrText xml:space="preserve"> PAGEREF _Toc224590069 \h </w:instrText>
+              <w:instrText xml:space="preserve"> PAGEREF _Toc224641009 \h </w:instrText>
             </w:r>
             <w:r>
               <w:rPr>
@@ -1120,11 +1120,11 @@
               <w:kern w:val="2"/>
               <w:sz w:val="24"/>
               <w:szCs w:val="24"/>
-              <w:lang w:val="el-GR" w:eastAsia="el-GR" w:bidi="he-IL"/>
+              <w:lang w:val="el-GR" w:eastAsia="el-GR"/>
               <w14:ligatures w14:val="standardContextual"/>
             </w:rPr>
           </w:pPr>
-          <w:hyperlink w:anchor="_Toc224590070" w:history="1">
+          <w:hyperlink w:anchor="_Toc224641010" w:history="1">
             <w:r>
               <w:rPr>
                 <w:rStyle w:val="Hyperlink"/>
@@ -1151,7 +1151,7 @@
                 <w:noProof/>
                 <w:webHidden/>
               </w:rPr>
-              <w:instrText xml:space="preserve"> PAGEREF _Toc224590070 \h </w:instrText>
+              <w:instrText xml:space="preserve"> PAGEREF _Toc224641010 \h </w:instrText>
             </w:r>
             <w:r>
               <w:rPr>
@@ -1194,11 +1194,11 @@
               <w:kern w:val="2"/>
               <w:sz w:val="24"/>
               <w:szCs w:val="24"/>
-              <w:lang w:val="el-GR" w:eastAsia="el-GR" w:bidi="he-IL"/>
+              <w:lang w:val="el-GR" w:eastAsia="el-GR"/>
               <w14:ligatures w14:val="standardContextual"/>
             </w:rPr>
           </w:pPr>
-          <w:hyperlink w:anchor="_Toc224590071" w:history="1">
+          <w:hyperlink w:anchor="_Toc224641011" w:history="1">
             <w:r>
               <w:rPr>
                 <w:rStyle w:val="Hyperlink"/>
@@ -1241,7 +1241,7 @@
                 <w:noProof/>
                 <w:webHidden/>
               </w:rPr>
-              <w:instrText xml:space="preserve"> PAGEREF _Toc224590071 \h </w:instrText>
+              <w:instrText xml:space="preserve"> PAGEREF _Toc224641011 \h </w:instrText>
             </w:r>
             <w:r>
               <w:rPr>
@@ -1284,11 +1284,11 @@
               <w:kern w:val="2"/>
               <w:sz w:val="24"/>
               <w:szCs w:val="24"/>
-              <w:lang w:val="el-GR" w:eastAsia="el-GR" w:bidi="he-IL"/>
+              <w:lang w:val="el-GR" w:eastAsia="el-GR"/>
               <w14:ligatures w14:val="standardContextual"/>
             </w:rPr>
           </w:pPr>
-          <w:hyperlink w:anchor="_Toc224590072" w:history="1">
+          <w:hyperlink w:anchor="_Toc224641012" w:history="1">
             <w:r>
               <w:rPr>
                 <w:rStyle w:val="Hyperlink"/>
@@ -1315,7 +1315,7 @@
                 <w:noProof/>
                 <w:webHidden/>
               </w:rPr>
-              <w:instrText xml:space="preserve"> PAGEREF _Toc224590072 \h </w:instrText>
+              <w:instrText xml:space="preserve"> PAGEREF _Toc224641012 \h </w:instrText>
             </w:r>
             <w:r>
               <w:rPr>
@@ -1358,11 +1358,11 @@
               <w:kern w:val="2"/>
               <w:sz w:val="24"/>
               <w:szCs w:val="24"/>
-              <w:lang w:val="el-GR" w:eastAsia="el-GR" w:bidi="he-IL"/>
+              <w:lang w:val="el-GR" w:eastAsia="el-GR"/>
               <w14:ligatures w14:val="standardContextual"/>
             </w:rPr>
           </w:pPr>
-          <w:hyperlink w:anchor="_Toc224590073" w:history="1">
+          <w:hyperlink w:anchor="_Toc224641013" w:history="1">
             <w:r>
               <w:rPr>
                 <w:rStyle w:val="Hyperlink"/>
@@ -1389,7 +1389,7 @@
                 <w:noProof/>
                 <w:webHidden/>
               </w:rPr>
-              <w:instrText xml:space="preserve"> PAGEREF _Toc224590073 \h </w:instrText>
+              <w:instrText xml:space="preserve"> PAGEREF _Toc224641013 \h </w:instrText>
             </w:r>
             <w:r>
               <w:rPr>
@@ -1432,11 +1432,11 @@
               <w:kern w:val="2"/>
               <w:sz w:val="24"/>
               <w:szCs w:val="24"/>
-              <w:lang w:val="el-GR" w:eastAsia="el-GR" w:bidi="he-IL"/>
+              <w:lang w:val="el-GR" w:eastAsia="el-GR"/>
               <w14:ligatures w14:val="standardContextual"/>
             </w:rPr>
           </w:pPr>
-          <w:hyperlink w:anchor="_Toc224590074" w:history="1">
+          <w:hyperlink w:anchor="_Toc224641014" w:history="1">
             <w:r>
               <w:rPr>
                 <w:rStyle w:val="Hyperlink"/>
@@ -1463,7 +1463,7 @@
                 <w:noProof/>
                 <w:webHidden/>
               </w:rPr>
-              <w:instrText xml:space="preserve"> PAGEREF _Toc224590074 \h </w:instrText>
+              <w:instrText xml:space="preserve"> PAGEREF _Toc224641014 \h </w:instrText>
             </w:r>
             <w:r>
               <w:rPr>
@@ -1506,7 +1506,7 @@
         <w:pStyle w:val="Heading1"/>
       </w:pPr>
       <w:bookmarkStart w:id="0" w:name="Xcc33a1ce217591d06f0093299ddd11f84478b0d"/>
-      <w:bookmarkStart w:id="1" w:name="_Toc224590056"/>
+      <w:bookmarkStart w:id="1" w:name="_Toc224640996"/>
       <w:r>
         <w:t>1. Εισαγωγή</w:t>
       </w:r>
@@ -1552,7 +1552,7 @@
         <w:pStyle w:val="Heading1"/>
       </w:pPr>
       <w:bookmarkStart w:id="2" w:name="Xbb1ef23a166f153514d2fc58a93c061bfa23961"/>
-      <w:bookmarkStart w:id="3" w:name="_Toc224590057"/>
+      <w:bookmarkStart w:id="3" w:name="_Toc224640997"/>
       <w:bookmarkEnd w:id="0"/>
       <w:r>
         <w:t>2. Εκτέλεση βασικών εντολών Docker</w:t>
@@ -1827,7 +1827,7 @@
         <w:pStyle w:val="Heading1"/>
       </w:pPr>
       <w:bookmarkStart w:id="4" w:name="X1db040548a789d0b7834d01a429d212b8591d53"/>
-      <w:bookmarkStart w:id="5" w:name="_Toc224590058"/>
+      <w:bookmarkStart w:id="5" w:name="_Toc224640998"/>
       <w:bookmarkEnd w:id="2"/>
       <w:r>
         <w:t>3. Εκτέλεση ενός απλού web server με Docker</w:t>
@@ -1970,7 +1970,7 @@
         <w:pStyle w:val="Heading1"/>
       </w:pPr>
       <w:bookmarkStart w:id="6" w:name="Xd57d55002d21ad1414cbb2c6f37b832cd665588"/>
-      <w:bookmarkStart w:id="7" w:name="_Toc224590059"/>
+      <w:bookmarkStart w:id="7" w:name="_Toc224640999"/>
       <w:bookmarkEnd w:id="4"/>
       <w:r>
         <w:t>4. Παράδειγμα 1: Δημιουργία νέου Docker κοντέινερ με προσθήκη αρχείων</w:t>
@@ -2007,7 +2007,7 @@
         <w:pStyle w:val="Heading2"/>
       </w:pPr>
       <w:bookmarkStart w:id="8" w:name="X9b6f29c7e26a8f8cd97bbf2997d530fdb975de1"/>
-      <w:bookmarkStart w:id="9" w:name="_Toc224590060"/>
+      <w:bookmarkStart w:id="9" w:name="_Toc224641000"/>
       <w:r>
         <w:t>4.1 Δημιουργία φακέλου εργασίας</w:t>
       </w:r>
@@ -2055,7 +2055,7 @@
         <w:pStyle w:val="Heading2"/>
       </w:pPr>
       <w:bookmarkStart w:id="10" w:name="X7c233ce1bf59afc1f94e060e699657d55a218ef"/>
-      <w:bookmarkStart w:id="11" w:name="_Toc224590061"/>
+      <w:bookmarkStart w:id="11" w:name="_Toc224641001"/>
       <w:bookmarkEnd w:id="8"/>
       <w:r>
         <w:t xml:space="preserve">4.2 Δημιουργία αρχείου </w:t>
@@ -2302,7 +2302,7 @@
         <w:pStyle w:val="Heading2"/>
       </w:pPr>
       <w:bookmarkStart w:id="12" w:name="Xe9eced70cbe947e30382cc6c4d63e9f9a7aa4d8"/>
-      <w:bookmarkStart w:id="13" w:name="_Toc224590062"/>
+      <w:bookmarkStart w:id="13" w:name="_Toc224641002"/>
       <w:bookmarkEnd w:id="10"/>
       <w:r>
         <w:t xml:space="preserve">4.3 Δημιουργία αρχείου </w:t>
@@ -2637,7 +2637,7 @@
         <w:pStyle w:val="Heading2"/>
       </w:pPr>
       <w:bookmarkStart w:id="14" w:name="X0146c3825a8d0043b9371b7ef2b4afa8648e19e"/>
-      <w:bookmarkStart w:id="15" w:name="_Toc224590063"/>
+      <w:bookmarkStart w:id="15" w:name="_Toc224641003"/>
       <w:bookmarkEnd w:id="12"/>
       <w:r>
         <w:t>4.4 Δημιουργία του Docker image</w:t>
@@ -2683,7 +2683,7 @@
         <w:pStyle w:val="Heading2"/>
       </w:pPr>
       <w:bookmarkStart w:id="16" w:name="Xd454e5912bad46cd9753903095c57c643e7c6d7"/>
-      <w:bookmarkStart w:id="17" w:name="_Toc224590064"/>
+      <w:bookmarkStart w:id="17" w:name="_Toc224641004"/>
       <w:bookmarkEnd w:id="14"/>
       <w:r>
         <w:t>4.5 Εκτέλεση του κοντέινερ</w:t>
@@ -2809,7 +2809,7 @@
         <w:pStyle w:val="Heading2"/>
       </w:pPr>
       <w:bookmarkStart w:id="18" w:name="X7b89fd83b78128d6c90933ba39f665bb2037963"/>
-      <w:bookmarkStart w:id="19" w:name="_Toc224590065"/>
+      <w:bookmarkStart w:id="19" w:name="_Toc224641005"/>
       <w:bookmarkEnd w:id="16"/>
       <w:r>
         <w:t>4.6 Διαχείριση και καθαρισμός</w:t>
@@ -2887,7 +2887,7 @@
         <w:pStyle w:val="Heading1"/>
       </w:pPr>
       <w:bookmarkStart w:id="20" w:name="X9fcb91061d905d4a5cb0d50f1a3569571e69a61"/>
-      <w:bookmarkStart w:id="21" w:name="_Toc224590066"/>
+      <w:bookmarkStart w:id="21" w:name="_Toc224641006"/>
       <w:bookmarkEnd w:id="6"/>
       <w:bookmarkEnd w:id="18"/>
       <w:r>
@@ -2989,7 +2989,7 @@
         <w:pStyle w:val="Heading2"/>
       </w:pPr>
       <w:bookmarkStart w:id="22" w:name="X1066121d3dae74ac4f115ee9f0731f3045b39b4"/>
-      <w:bookmarkStart w:id="23" w:name="_Toc224590067"/>
+      <w:bookmarkStart w:id="23" w:name="_Toc224641007"/>
       <w:r>
         <w:t>5.1 Δημιουργία φακέλου εργασίας</w:t>
       </w:r>
@@ -3032,7 +3032,7 @@
         <w:pStyle w:val="Heading2"/>
       </w:pPr>
       <w:bookmarkStart w:id="24" w:name="X3e2466b938ec892b171b42ef943798b2523adb7"/>
-      <w:bookmarkStart w:id="25" w:name="_Toc224590068"/>
+      <w:bookmarkStart w:id="25" w:name="_Toc224641008"/>
       <w:bookmarkEnd w:id="22"/>
       <w:r>
         <w:t xml:space="preserve">5.2 Δημιουργία </w:t>
@@ -3757,7 +3757,7 @@
         <w:pStyle w:val="Heading2"/>
       </w:pPr>
       <w:bookmarkStart w:id="26" w:name="X1f5f489ffff4398b6e09964cb301f2e2d9a1e76"/>
-      <w:bookmarkStart w:id="27" w:name="_Toc224590069"/>
+      <w:bookmarkStart w:id="27" w:name="_Toc224641009"/>
       <w:bookmarkEnd w:id="24"/>
       <w:r>
         <w:t>5.3 Δημιουργία φακέλων για HTML αρχεία</w:t>
@@ -3786,7 +3786,7 @@
         <w:pStyle w:val="Heading2"/>
       </w:pPr>
       <w:bookmarkStart w:id="28" w:name="Xecba9262b887540d7c27e150c9d24f951e08965"/>
-      <w:bookmarkStart w:id="29" w:name="_Toc224590070"/>
+      <w:bookmarkStart w:id="29" w:name="_Toc224641010"/>
       <w:bookmarkEnd w:id="26"/>
       <w:r>
         <w:lastRenderedPageBreak/>
@@ -3911,7 +3911,7 @@
         <w:pStyle w:val="Heading2"/>
       </w:pPr>
       <w:bookmarkStart w:id="30" w:name="Xf304e225dcae6d108052b25fee09bbc2d5f67f2"/>
-      <w:bookmarkStart w:id="31" w:name="_Toc224590071"/>
+      <w:bookmarkStart w:id="31" w:name="_Toc224641011"/>
       <w:bookmarkEnd w:id="28"/>
       <w:r>
         <w:t xml:space="preserve">5.5 Δημιουργία αρχείου </w:t>
@@ -4172,7 +4172,7 @@
         <w:pStyle w:val="Heading1"/>
       </w:pPr>
       <w:bookmarkStart w:id="32" w:name="X1dcc68e729c6e99bc2e2525caad1084925bd86c"/>
-      <w:bookmarkStart w:id="33" w:name="_Toc224590072"/>
+      <w:bookmarkStart w:id="33" w:name="_Toc224641012"/>
       <w:bookmarkEnd w:id="20"/>
       <w:bookmarkEnd w:id="30"/>
       <w:r>
@@ -4241,7 +4241,7 @@
         <w:pStyle w:val="Heading2"/>
       </w:pPr>
       <w:bookmarkStart w:id="34" w:name="X14d0dd8a20e519cdca56c30a2eee66e45260be8"/>
-      <w:bookmarkStart w:id="35" w:name="_Toc224590073"/>
+      <w:bookmarkStart w:id="35" w:name="_Toc224641013"/>
       <w:r>
         <w:t>6.1 Ephemeral storage (τα δεδομένα χάνονται)</w:t>
       </w:r>
@@ -4509,7 +4509,7 @@
         <w:pStyle w:val="Heading2"/>
       </w:pPr>
       <w:bookmarkStart w:id="36" w:name="Xc076a7ec84df8afab1dabd4f76002abcb3bf7da"/>
-      <w:bookmarkStart w:id="37" w:name="_Toc224590074"/>
+      <w:bookmarkStart w:id="37" w:name="_Toc224641014"/>
       <w:bookmarkEnd w:id="34"/>
       <w:r>
         <w:t>6.2 Persistent storage (τα δεδομένα διατηρούνται)</w:t>
@@ -5335,7 +5335,7 @@
   <w:abstractNum w:abstractNumId="9" w15:restartNumberingAfterBreak="0">
     <w:nsid w:val="0000A990"/>
     <w:multiLevelType w:val="multilevel"/>
-    <w:tmpl w:val="6316DD86"/>
+    <w:tmpl w:val="2578F8E0"/>
     <w:lvl w:ilvl="0">
       <w:numFmt w:val="bullet"/>
       <w:lvlText w:val=" "/>
@@ -5412,7 +5412,7 @@
   <w:abstractNum w:abstractNumId="10" w15:restartNumberingAfterBreak="0">
     <w:nsid w:val="0000A991"/>
     <w:multiLevelType w:val="multilevel"/>
-    <w:tmpl w:val="C27A36EE"/>
+    <w:tmpl w:val="89C0F1D2"/>
     <w:lvl w:ilvl="0">
       <w:numFmt w:val="bullet"/>
       <w:lvlText w:val=""/>
@@ -5513,46 +5513,46 @@
       </w:rPr>
     </w:lvl>
   </w:abstractNum>
-  <w:num w:numId="1" w16cid:durableId="971138215">
+  <w:num w:numId="1" w16cid:durableId="763500124">
     <w:abstractNumId w:val="8"/>
   </w:num>
-  <w:num w:numId="2" w16cid:durableId="956177499">
+  <w:num w:numId="2" w16cid:durableId="612251852">
     <w:abstractNumId w:val="6"/>
   </w:num>
-  <w:num w:numId="3" w16cid:durableId="1282876299">
+  <w:num w:numId="3" w16cid:durableId="1990861319">
     <w:abstractNumId w:val="5"/>
   </w:num>
-  <w:num w:numId="4" w16cid:durableId="747918504">
+  <w:num w:numId="4" w16cid:durableId="204870537">
     <w:abstractNumId w:val="4"/>
   </w:num>
-  <w:num w:numId="5" w16cid:durableId="2145390032">
+  <w:num w:numId="5" w16cid:durableId="232663394">
     <w:abstractNumId w:val="7"/>
   </w:num>
-  <w:num w:numId="6" w16cid:durableId="206911818">
+  <w:num w:numId="6" w16cid:durableId="553273910">
     <w:abstractNumId w:val="3"/>
   </w:num>
-  <w:num w:numId="7" w16cid:durableId="491992835">
+  <w:num w:numId="7" w16cid:durableId="261962409">
     <w:abstractNumId w:val="2"/>
   </w:num>
-  <w:num w:numId="8" w16cid:durableId="1213999481">
+  <w:num w:numId="8" w16cid:durableId="518280755">
     <w:abstractNumId w:val="1"/>
   </w:num>
-  <w:num w:numId="9" w16cid:durableId="252518712">
+  <w:num w:numId="9" w16cid:durableId="66416044">
     <w:abstractNumId w:val="0"/>
   </w:num>
-  <w:num w:numId="10" w16cid:durableId="1916934063">
+  <w:num w:numId="10" w16cid:durableId="550115689">
     <w:abstractNumId w:val="9"/>
   </w:num>
-  <w:num w:numId="11" w16cid:durableId="1844471720">
+  <w:num w:numId="11" w16cid:durableId="658311485">
     <w:abstractNumId w:val="10"/>
   </w:num>
-  <w:num w:numId="12" w16cid:durableId="1577742139">
+  <w:num w:numId="12" w16cid:durableId="259919844">
     <w:abstractNumId w:val="10"/>
   </w:num>
-  <w:num w:numId="13" w16cid:durableId="1154293376">
+  <w:num w:numId="13" w16cid:durableId="529925182">
     <w:abstractNumId w:val="10"/>
   </w:num>
-  <w:num w:numId="14" w16cid:durableId="2073117769">
+  <w:num w:numId="14" w16cid:durableId="598954827">
     <w:abstractNumId w:val="10"/>
   </w:num>
 </w:numbering>
@@ -17373,7 +17373,7 @@
     <w:autoRedefine/>
     <w:uiPriority w:val="39"/>
     <w:unhideWhenUsed/>
-    <w:rsid w:val="00454A5D"/>
+    <w:rsid w:val="00CB7437"/>
     <w:pPr>
       <w:spacing w:after="100"/>
     </w:pPr>
@@ -17385,7 +17385,7 @@
     <w:autoRedefine/>
     <w:uiPriority w:val="39"/>
     <w:unhideWhenUsed/>
-    <w:rsid w:val="00454A5D"/>
+    <w:rsid w:val="00CB7437"/>
     <w:pPr>
       <w:spacing w:after="100"/>
       <w:ind w:left="220"/>
@@ -17396,7 +17396,7 @@
     <w:basedOn w:val="DefaultParagraphFont"/>
     <w:uiPriority w:val="99"/>
     <w:unhideWhenUsed/>
-    <w:rsid w:val="00454A5D"/>
+    <w:rsid w:val="00CB7437"/>
     <w:rPr>
       <w:color w:val="0000FF" w:themeColor="hyperlink"/>
       <w:u w:val="single"/>

</xml_diff>